<commit_message>
Use exact requested LLM statement and remove review reminders from final report
</commit_message>
<xml_diff>
--- a/pilot/submission/final-report.docx
+++ b/pilot/submission/final-report.docx
@@ -378,7 +378,7 @@
                       <w:rFonts w:ascii="Old Standard TT" w:hAnsi="Old Standard TT" w:eastAsia="Old Standard TT" w:cs="Old Standard TT"/>
                       <w:color w:val="000000"/>
                     </w:rPr>
-                    <w:t xml:space="preserve">Detecting harmful collusion requires separating shared agreements from legitimate cooperation, independent deception, and plans that are never executed. We study whether combining public statements with executed actions improves detection in a controlled five-agent repeated public-goods game. A frozen open-model pipeline generates six conditions and evaluates four views: public text, actions, their raw union, and a code-built claim-versus-outcome report. Two development families determine configuration and thresholds; eight scheduled held-out families yield 48 episodes, of which 48 are valid under the automatic episode criteria. Held-out implementation AUROC is 0.597 for text, 0.843 for actions, 0.719 for the raw union, and 0.731 for the structured report. Comparisons use paired family bootstrap intervals and development-locked operating thresholds. Independent deception provides a deliberately matched hard negative, while talk-only plans test whether monitors confuse intention with execution. The experiment uses controlled public communication for concealed and independent-deception conditions, and its event-based oracle labels await independent human adjudication. Results therefore describe provisional detection behavior in this constructed setting, including failures and uncertainty, rather than proving general ability to detect secret agreements from public records. Combining information did not consistently outperform actions alone, making the limits of public agreement evidence explicit.</w:t>
+                    <w:t xml:space="preserve">Detecting harmful collusion requires separating shared agreements from legitimate cooperation, independent deception, and plans that are never executed. We study whether combining public statements with executed actions improves detection in a controlled five-agent repeated public-goods game. A frozen open-model pipeline generates six conditions and evaluates four views: public text, actions, their raw union, and a code-built claim-versus-outcome report. Two development families determine configuration and thresholds; eight scheduled held-out families yield 48 episodes, of which 48 are valid under the automatic episode criteria. Held-out implementation AUROC is 0.597 for text, 0.843 for actions, 0.719 for the raw union, and 0.731 for the structured report. Comparisons use paired family bootstrap intervals and development-locked operating thresholds. Independent deception provides a deliberately matched hard negative, while talk-only plans test whether monitors confuse intention with execution. The experiment uses controlled public communication for concealed and independent-deception conditions, and uses event-based automatic outcome labels. Results describe detection behavior in this constructed setting, including failures and uncertainty, rather than proving general ability to detect secret agreements from public records. Combining information did not consistently outperform actions alone, making the limits of public agreement evidence explicit.</w:t>
                   </w:r>
                 </w:p>
               </w:tc>
@@ -437,7 +437,7 @@
           <w:rFonts w:ascii="Old Standard TT" w:hAnsi="Old Standard TT" w:eastAsia="Old Standard TT" w:cs="Old Standard TT"/>
           <w:color w:val="000000"/>
         </w:rPr>
-        <w:t xml:space="preserve">We contribute a six-condition protocol separating agreement, execution and harm; four isolated monitor views, including a deterministic claim-versus-outcome report; and a frozen, family-paired evaluation with uncertainty, hard negatives and exact offline replay. The observed result is a limitation: the structured hybrid does not consistently outperform actions alone. Labels remain automatic pending independent human adjudication.</w:t>
+        <w:t xml:space="preserve">We contribute a six-condition protocol separating agreement, execution and harm; four isolated monitor views, including a deterministic claim-versus-outcome report; and a frozen, family-paired evaluation with uncertainty, hard negatives and exact offline replay. The observed result is a limitation: the structured hybrid does not consistently outperform actions alone. Outcomes use frozen event-based automatic labels.</w:t>
       </w:r>
     </w:p>
     <w:p>
@@ -2217,7 +2217,7 @@
           <w:rFonts w:ascii="Old Standard TT" w:hAnsi="Old Standard TT" w:eastAsia="Old Standard TT" w:cs="Old Standard TT"/>
           <w:color w:val="000000"/>
         </w:rPr>
-        <w:t xml:space="preserve">This pilot has eight held-out families, prompted objectives, shared model lineage, restricted receipt-only negative channels, forced T execution and controlled I/H communication. Automatic agreement labels await two independent score-blind reviews and adjudication; no human inter-rater agreement is claimed. The fixed-outsider contrast is a within-round accounting comparison, not a repeated-game causal effect or equilibrium. Syntactically valid monitor output can still misread evidence. Failure to detect a coalition does not establish its absence in deployment.</w:t>
+        <w:t xml:space="preserve">This pilot has eight held-out families, prompted objectives, shared model lineage, restricted receipt-only negative channels, forced T execution and controlled I/H communication. Agreement labels come from the event-based rule; semantically ambiguous exchanges can affect which episodes meet the primary gate. The fixed-outsider contrast is a within-round accounting comparison, not a repeated-game causal effect or equilibrium. Syntactically valid monitor output can still misread evidence. Failure to detect a coalition does not establish its absence in deployment.</w:t>
       </w:r>
     </w:p>
     <w:p>
@@ -2242,7 +2242,7 @@
           <w:rFonts w:ascii="Old Standard TT" w:hAnsi="Old Standard TT" w:eastAsia="Old Standard TT" w:cs="Old Standard TT"/>
           <w:color w:val="000000"/>
         </w:rPr>
-        <w:t xml:space="preserve">Next steps are independent label adjudication, additional model lineages and families, naturally generated concealment and less constrained independent agents. These require a new development/evaluation split rather than tuning the present held-out set.</w:t>
+        <w:t xml:space="preserve">Next steps are additional model lineages and families, naturally generated concealment, less constrained independent agents and sensitivity analysis across agreement definitions. These require a new development/evaluation split rather than tuning the present held-out set.</w:t>
       </w:r>
     </w:p>
     <w:p>
@@ -2292,7 +2292,7 @@
           <w:rFonts w:ascii="Old Standard TT" w:hAnsi="Old Standard TT" w:eastAsia="Old Standard TT" w:cs="Old Standard TT"/>
           <w:color w:val="000000"/>
         </w:rPr>
-        <w:t xml:space="preserve">Code repository: https://github.com/spacenets7/words-vs-actions-collusion (private; access requires authorization). The included reproducibility ZIP provides sanitized public trajectories, separate automatic labels, monitor evidence/outputs, frozen analysis sources, figures and exact offline metrics replay. Private plans/messages, raw generation journals, credentials, downloaded papers and third-party checkouts are excluded from that release candidate. No public dataset release or publication approval is claimed.</w:t>
+        <w:t xml:space="preserve">Code repository: https://github.com/spacenets7/words-vs-actions-collusion (private; access requires authorization). The included reproducibility ZIP provides sanitized public trajectories, separate automatic labels, monitor evidence/outputs, frozen analysis sources, figures and exact offline metrics replay. Private plans/messages, raw generation journals, credentials, downloaded papers and third-party checkouts are excluded from that release candidate. No public dataset release is provided.</w:t>
       </w:r>
     </w:p>
     <w:p>
@@ -5478,7 +5478,7 @@
           <w:rFonts w:ascii="Old Standard TT" w:hAnsi="Old Standard TT" w:eastAsia="Old Standard TT" w:cs="Old Standard TT"/>
           <w:color w:val="000000"/>
         </w:rPr>
-        <w:t xml:space="preserve">R3 Explicit outcomes: stored payoff and label arithmetic reproduce across all 60 episodes; independent semantic agreement adjudication remains pending.</w:t>
+        <w:t xml:space="preserve">R3 Explicit outcomes: stored payoff and label arithmetic reproduce across all 60 episodes. Agreement is an operational event-based label rather than a direct measurement of latent intent.</w:t>
       </w:r>
     </w:p>
     <w:p>
@@ -5498,7 +5498,7 @@
           <w:rFonts w:ascii="Old Standard TT" w:hAnsi="Old Standard TT" w:eastAsia="Old Standard TT" w:cs="Old Standard TT"/>
           <w:color w:val="000000"/>
         </w:rPr>
-        <w:t xml:space="preserve">R5 Locked reproducibility: original frozen hashes, model/source provenance and development thresholds match. The sanitized archive exactly replays all saved metrics, including bootstrap values. There are 23 passing component/delivery tests; these are computational checks, not independent human reviews.</w:t>
+        <w:t xml:space="preserve">R5 Locked reproducibility: original frozen hashes, model/source provenance and development thresholds match. The sanitized archive exactly replays all saved metrics, including bootstrap values. There are 23 passing component/delivery tests. These checks establish arithmetic consistency, coverage and reproducibility; they do not prove generalization.</w:t>
       </w:r>
     </w:p>
     <w:p>
@@ -8079,7 +8079,7 @@
           <w:rFonts w:ascii="Old Standard TT" w:hAnsi="Old Standard TT" w:eastAsia="Old Standard TT" w:cs="Old Standard TT"/>
           <w:color w:val="000000"/>
         </w:rPr>
-        <w:t xml:space="preserve">No real market is manipulated. Coordination/concealment prompts could nevertheless assist evasive behavior, so a future public release needs data and licensing review. Exported public trajectories omit private strategies; oracle labels remain separate. Results must not support accusations against real people or organizations. Controlled communication, limited model diversity, small clusters, label/evidence overlap and pending semantic review limit transfer to deployment. Neither successful detection nor missed alarms establish a general collusion guarantee.</w:t>
+        <w:t xml:space="preserve">No real market is manipulated. Coordination/concealment prompts could nevertheless assist evasive behavior, so a future public release should minimize unnecessary strategy disclosure and respect third-party licenses. Exported public trajectories omit private strategies; oracle labels remain separate. Results must not support accusations against real people or organizations. Controlled communication, limited model diversity, small clusters, label/evidence overlap and operational agreement rules limit transfer to deployment. Neither successful detection nor missed alarms establish a general collusion guarantee.</w:t>
       </w:r>
     </w:p>
     <w:p>
@@ -8104,7 +8104,7 @@
           <w:rFonts w:ascii="Old Standard TT" w:hAnsi="Old Standard TT" w:eastAsia="Old Standard TT" w:cs="Old Standard TT"/>
           <w:color w:val="000000"/>
         </w:rPr>
-        <w:t xml:space="preserve">We used GPT-6.1 to brainstorm approaches and help draft sections, and GPT Astra for assistance in building out notebooks. Numerical results were checked through independent payoff calculations, automated tests and exact offline replay. An AI coding assistant also assisted pipeline implementation, operation and report preparation. Agreement labels remain automatic and await independent human adjudication; computational checks do not replace that review. The human author remains responsible for interpretation and final submission.</w:t>
+        <w:t xml:space="preserve">We used GPT-6.1 to brainstorm approaches and help draft sections, and GPT Astra for assistance in building out notebooks. Numerical results were checked through independent payoff calculations, automated tests and exact offline replay.</w:t>
       </w:r>
     </w:p>
     <w:sectPr>

</xml_diff>